<commit_message>
Checkpoint: QA review + assessment artifacts in progress
Intermediate snapshot while reviewer/author agents refine weeks and build
the Assessments/ deliverables. A final rebuild + full validation pass follows.

Co-Authored-By: Claude Opus 4.8 <noreply@anthropic.com>
Claude-Session: https://claude.ai/code/session_012jACa3xvaCp9Yvx3Z8JvKT
</commit_message>
<xml_diff>
--- a/Causal_Inference_Course/Week03_Randomized_Experiments_AB_Testing/Week03_Randomized_Experiments_AB_Testing_Self_Study_Packet.docx
+++ b/Causal_Inference_Course/Week03_Randomized_Experiments_AB_Testing/Week03_Randomized_Experiments_AB_Testing_Self_Study_Packet.docx
@@ -1074,7 +1074,7 @@
           <w:color w:val="222732"/>
           <w:sz w:val="22"/>
         </w:rPr>
-        <w:t>You intended a 50/50 split. After a week you have 498,000 users in control and 502,000 in treatment — but a chi-square test against 50/50 returns p ≈ 0.001. The treatment metric looks great. What does the SRM imply, and what should you do?</w:t>
+        <w:t>You intended a 50/50 split. After a week you have 498,000 users in control and 502,000 in treatment — but a chi-square test against 50/50 returns p ≈ 6e-5. The treatment metric looks great. What does the SRM imply, and what should you do?</w:t>
       </w:r>
     </w:p>
     <w:p>
@@ -1408,7 +1408,7 @@
           <w:color w:val="222732"/>
           <w:sz w:val="22"/>
         </w:rPr>
-        <w:t>Under a correct 50/50 randomization the counts should match the intended ratio up to sampling noise. A p ≈ 0.001 against 50/50 means the imbalance is far larger than chance — a sample-ratio mismatch.</w:t>
+        <w:t>Under a correct 50/50 randomization the counts should match the intended ratio up to sampling noise. A p ≈ 6e-5 against 50/50 means the imbalance is far larger than chance — a sample-ratio mismatch. (With a million users even a 0.4% split skew is wildly improbable under a fair coin.)</w:t>
       </w:r>
     </w:p>
     <w:p>

</xml_diff>